<commit_message>
Make minor corrections to literature review
</commit_message>
<xml_diff>
--- a/thesis/chapters/02_literature_review/Literature Review (2.1 & 2.2).docx
+++ b/thesis/chapters/02_literature_review/Literature Review (2.1 & 2.2).docx
@@ -527,43 +527,25 @@
         <w:rPr>
           <w:rFonts w:ascii="Times New Roman" w:hAnsi="Times New Roman" w:cs="Times New Roman"/>
         </w:rPr>
-        <w:t xml:space="preserve">, </w:t>
-      </w:r>
-      <w:r>
-        <w:rPr>
-          <w:rFonts w:ascii="Times New Roman" w:hAnsi="Times New Roman" w:cs="Times New Roman"/>
-        </w:rPr>
-        <w:t xml:space="preserve">given that evidence from UK parliamentary speech shows that </w:t>
-      </w:r>
-      <w:r>
-        <w:rPr>
-          <w:rFonts w:ascii="Times New Roman" w:hAnsi="Times New Roman" w:cs="Times New Roman"/>
-        </w:rPr>
-        <w:t>negative evaluations of political opponents capture</w:t>
+        <w:t>. E</w:t>
+      </w:r>
+      <w:r>
+        <w:rPr>
+          <w:rFonts w:ascii="Times New Roman" w:hAnsi="Times New Roman" w:cs="Times New Roman"/>
+        </w:rPr>
+        <w:t xml:space="preserve">vidence from UK parliamentary </w:t>
+      </w:r>
+      <w:r>
+        <w:rPr>
+          <w:rFonts w:ascii="Times New Roman" w:hAnsi="Times New Roman" w:cs="Times New Roman"/>
+        </w:rPr>
+        <w:t>speech shows that negative evaluations of political opponents follow patterns distinct from those of mass affective polarisation and elite ideological polarisation</w:t>
       </w:r>
       <w:r>
         <w:rPr>
           <w:rFonts w:ascii="Times New Roman" w:hAnsi="Times New Roman" w:cs="Times New Roman"/>
         </w:rPr>
         <w:t xml:space="preserve"> </w:t>
-      </w:r>
-      <w:r>
-        <w:rPr>
-          <w:rFonts w:ascii="Times New Roman" w:hAnsi="Times New Roman" w:cs="Times New Roman"/>
-        </w:rPr>
-        <w:t>distinct outcome</w:t>
-      </w:r>
-      <w:r>
-        <w:rPr>
-          <w:rFonts w:ascii="Times New Roman" w:hAnsi="Times New Roman" w:cs="Times New Roman"/>
-        </w:rPr>
-        <w:t>s</w:t>
-      </w:r>
-      <w:r>
-        <w:rPr>
-          <w:rFonts w:ascii="Times New Roman" w:hAnsi="Times New Roman" w:cs="Times New Roman"/>
-        </w:rPr>
-        <w:t xml:space="preserve"> from both mass affective polarisation and elite ideological polarisation </w:t>
       </w:r>
       <w:r>
         <w:rPr>
@@ -613,7 +595,7 @@
         <w:rPr>
           <w:rFonts w:ascii="Times New Roman" w:hAnsi="Times New Roman" w:cs="Times New Roman"/>
         </w:rPr>
-        <w:t xml:space="preserve">An ideological position describes where an individual stands on an ideological dimension, while ideological polarisation concerns how these positions are distributed, including the distance between groups and the concentration of positions within them </w:t>
+        <w:t xml:space="preserve">Regarding ideological polarisation, an individual’s position must be distinguished from how positions are distributed across individuals or groups. An ideological position describes where someone stands on an ideological dimension, whereas ideological polarisation concerns the distance between groups and the concentration of positions within them </w:t>
       </w:r>
       <w:r>
         <w:rPr>
@@ -705,7 +687,14 @@
         <w:rPr>
           <w:rFonts w:ascii="Times New Roman" w:hAnsi="Times New Roman" w:cs="Times New Roman"/>
         </w:rPr>
-        <w:t xml:space="preserve">People’s perceptions of ideological differences must also be distinguished from the differences themselves. Perceived ideological polarisation concerns how far apart people believe the parties and their supporters are, whereas ideological divergence concerns how ideological positions are distributed and </w:t>
+        <w:t xml:space="preserve">People’s perceptions of ideological differences must also be distinguished from the differences themselves. Perceived ideological polarisation concerns how far apart people believe the parties and their supporters are, whereas ideological divergence concerns how </w:t>
+      </w:r>
+      <w:r>
+        <w:rPr>
+          <w:rFonts w:ascii="Times New Roman" w:hAnsi="Times New Roman" w:cs="Times New Roman"/>
+        </w:rPr>
+        <w:lastRenderedPageBreak/>
+        <w:t xml:space="preserve">ideological positions are distributed and </w:t>
       </w:r>
       <w:r>
         <w:rPr>
@@ -717,14 +706,25 @@
         <w:rPr>
           <w:rFonts w:ascii="Times New Roman" w:hAnsi="Times New Roman" w:cs="Times New Roman"/>
         </w:rPr>
-        <w:t xml:space="preserve"> they move apart. Ideological consistency </w:t>
-      </w:r>
-      <w:r>
-        <w:rPr>
-          <w:rFonts w:ascii="Times New Roman" w:hAnsi="Times New Roman" w:cs="Times New Roman"/>
-        </w:rPr>
-        <w:lastRenderedPageBreak/>
-        <w:t xml:space="preserve">concerns alignment across issue positions and between ideology and party identity. Greater consistency therefore need not imply greater ideological distance </w:t>
+        <w:t xml:space="preserve"> they move apart. </w:t>
+      </w:r>
+      <w:r>
+        <w:rPr>
+          <w:rFonts w:ascii="Times New Roman" w:hAnsi="Times New Roman" w:cs="Times New Roman"/>
+        </w:rPr>
+        <w:t>Nevertheless</w:t>
+      </w:r>
+      <w:r>
+        <w:rPr>
+          <w:rFonts w:ascii="Times New Roman" w:hAnsi="Times New Roman" w:cs="Times New Roman"/>
+        </w:rPr>
+        <w:t>, greater ideological consistency does not necessarily mean that positions move further apart. It concerns how closely people’s views across issues align with one another and how their ideology aligns with their party identity, rather than the distance between their positions</w:t>
+      </w:r>
+      <w:r>
+        <w:rPr>
+          <w:rFonts w:ascii="Times New Roman" w:hAnsi="Times New Roman" w:cs="Times New Roman"/>
+        </w:rPr>
+        <w:t xml:space="preserve"> </w:t>
       </w:r>
       <w:commentRangeStart w:id="0"/>
       <w:r>
@@ -1123,109 +1123,7 @@
         <w:rPr>
           <w:rFonts w:ascii="Times New Roman" w:hAnsi="Times New Roman" w:cs="Times New Roman"/>
         </w:rPr>
-        <w:t>T</w:t>
-      </w:r>
-      <w:r>
-        <w:rPr>
-          <w:rFonts w:ascii="Times New Roman" w:hAnsi="Times New Roman" w:cs="Times New Roman"/>
-        </w:rPr>
-        <w:t>he</w:t>
-      </w:r>
-      <w:r>
-        <w:rPr>
-          <w:rFonts w:ascii="Times New Roman" w:hAnsi="Times New Roman" w:cs="Times New Roman"/>
-        </w:rPr>
-        <w:t>se</w:t>
-      </w:r>
-      <w:r>
-        <w:rPr>
-          <w:rFonts w:ascii="Times New Roman" w:hAnsi="Times New Roman" w:cs="Times New Roman"/>
-        </w:rPr>
-        <w:t xml:space="preserve"> different</w:t>
-      </w:r>
-      <w:r>
-        <w:rPr>
-          <w:rFonts w:ascii="Times New Roman" w:hAnsi="Times New Roman" w:cs="Times New Roman"/>
-        </w:rPr>
-        <w:t xml:space="preserve"> ways of </w:t>
-      </w:r>
-      <w:r>
-        <w:rPr>
-          <w:rFonts w:ascii="Times New Roman" w:hAnsi="Times New Roman" w:cs="Times New Roman"/>
-        </w:rPr>
-        <w:t>understanding</w:t>
-      </w:r>
-      <w:r>
-        <w:rPr>
-          <w:rFonts w:ascii="Times New Roman" w:hAnsi="Times New Roman" w:cs="Times New Roman"/>
-        </w:rPr>
-        <w:t xml:space="preserve"> political polarization</w:t>
-      </w:r>
-      <w:r>
-        <w:rPr>
-          <w:rFonts w:ascii="Times New Roman" w:hAnsi="Times New Roman" w:cs="Times New Roman"/>
-        </w:rPr>
-        <w:t xml:space="preserve"> </w:t>
-      </w:r>
-      <w:r>
-        <w:rPr>
-          <w:rFonts w:ascii="Times New Roman" w:hAnsi="Times New Roman" w:cs="Times New Roman"/>
-        </w:rPr>
-        <w:t>support the next section</w:t>
-      </w:r>
-      <w:r>
-        <w:rPr>
-          <w:rFonts w:ascii="Times New Roman" w:hAnsi="Times New Roman" w:cs="Times New Roman"/>
-        </w:rPr>
-        <w:t>s, which</w:t>
-      </w:r>
-      <w:r>
-        <w:rPr>
-          <w:rFonts w:ascii="Times New Roman" w:hAnsi="Times New Roman" w:cs="Times New Roman"/>
-        </w:rPr>
-        <w:t xml:space="preserve"> look</w:t>
-      </w:r>
-      <w:r>
-        <w:rPr>
-          <w:rFonts w:ascii="Times New Roman" w:hAnsi="Times New Roman" w:cs="Times New Roman"/>
-        </w:rPr>
-        <w:t xml:space="preserve"> </w:t>
-      </w:r>
-      <w:r>
-        <w:rPr>
-          <w:rFonts w:ascii="Times New Roman" w:hAnsi="Times New Roman" w:cs="Times New Roman"/>
-        </w:rPr>
-        <w:t>into the literature concern</w:t>
-      </w:r>
-      <w:r>
-        <w:rPr>
-          <w:rFonts w:ascii="Times New Roman" w:hAnsi="Times New Roman" w:cs="Times New Roman"/>
-        </w:rPr>
-        <w:t xml:space="preserve">ing the </w:t>
-      </w:r>
-      <w:r>
-        <w:rPr>
-          <w:rFonts w:ascii="Times New Roman" w:hAnsi="Times New Roman" w:cs="Times New Roman"/>
-        </w:rPr>
-        <w:t xml:space="preserve">development of polarisation, </w:t>
-      </w:r>
-      <w:r>
-        <w:rPr>
-          <w:rFonts w:ascii="Times New Roman" w:hAnsi="Times New Roman" w:cs="Times New Roman"/>
-        </w:rPr>
-        <w:t>especially</w:t>
-      </w:r>
-      <w:r>
-        <w:rPr>
-          <w:rFonts w:ascii="Times New Roman" w:hAnsi="Times New Roman" w:cs="Times New Roman"/>
-        </w:rPr>
-        <w:t xml:space="preserve"> in the US Congress.</w:t>
-      </w:r>
-      <w:r>
-        <w:rPr>
-          <w:rFonts w:ascii="Times New Roman" w:hAnsi="Times New Roman" w:cs="Times New Roman"/>
-        </w:rPr>
-        <w:t xml:space="preserve"> </w:t>
+        <w:t>These distinctions guide the following review of congressional polarisation, from voting and speech-based evidence to newer LLM approaches, focusing on how different measures capture political positions and changes over time.</w:t>
       </w:r>
     </w:p>
     <w:p>
@@ -1393,6 +1291,7 @@
         <w:rPr>
           <w:rFonts w:ascii="Times New Roman" w:hAnsi="Times New Roman" w:cs="Times New Roman"/>
         </w:rPr>
+        <w:lastRenderedPageBreak/>
         <w:t>These party divisions also extended across policy areas.</w:t>
       </w:r>
       <w:r>
@@ -1495,14 +1394,7 @@
         <w:rPr>
           <w:rFonts w:ascii="Times New Roman" w:hAnsi="Times New Roman" w:cs="Times New Roman"/>
         </w:rPr>
-        <w:t xml:space="preserve">over </w:t>
-      </w:r>
-      <w:r>
-        <w:rPr>
-          <w:rFonts w:ascii="Times New Roman" w:hAnsi="Times New Roman" w:cs="Times New Roman"/>
-        </w:rPr>
-        <w:lastRenderedPageBreak/>
-        <w:t>cultural issues</w:t>
+        <w:t>over cultural issues</w:t>
       </w:r>
       <w:r>
         <w:rPr>
@@ -1532,55 +1424,13 @@
         <w:rPr>
           <w:rFonts w:ascii="Times New Roman" w:hAnsi="Times New Roman" w:cs="Times New Roman"/>
         </w:rPr>
-        <w:t xml:space="preserve"> These </w:t>
-      </w:r>
-      <w:r>
-        <w:rPr>
-          <w:rFonts w:ascii="Times New Roman" w:hAnsi="Times New Roman" w:cs="Times New Roman"/>
-        </w:rPr>
-        <w:t>newer issues</w:t>
-      </w:r>
-      <w:r>
-        <w:rPr>
-          <w:rFonts w:ascii="Times New Roman" w:hAnsi="Times New Roman" w:cs="Times New Roman"/>
-        </w:rPr>
-        <w:t xml:space="preserve"> showing increased party division </w:t>
-      </w:r>
-      <w:r>
-        <w:rPr>
-          <w:rFonts w:ascii="Times New Roman" w:hAnsi="Times New Roman" w:cs="Times New Roman"/>
-        </w:rPr>
-        <w:t>did not replace the older social-welfare</w:t>
-      </w:r>
-      <w:r>
-        <w:rPr>
-          <w:rFonts w:ascii="Times New Roman" w:hAnsi="Times New Roman" w:cs="Times New Roman"/>
-        </w:rPr>
-        <w:t xml:space="preserve"> issues</w:t>
-      </w:r>
-      <w:r>
-        <w:rPr>
-          <w:rFonts w:ascii="Times New Roman" w:hAnsi="Times New Roman" w:cs="Times New Roman"/>
-        </w:rPr>
-        <w:t xml:space="preserve"> separation</w:t>
-      </w:r>
-      <w:r>
-        <w:rPr>
-          <w:rFonts w:ascii="Times New Roman" w:hAnsi="Times New Roman" w:cs="Times New Roman"/>
-        </w:rPr>
-        <w:t>, process which describes a conflict extension over</w:t>
-      </w:r>
-      <w:r>
-        <w:rPr>
-          <w:rFonts w:ascii="Times New Roman" w:hAnsi="Times New Roman" w:cs="Times New Roman"/>
-        </w:rPr>
         <w:t xml:space="preserve"> </w:t>
       </w:r>
       <w:r>
         <w:rPr>
           <w:rFonts w:ascii="Times New Roman" w:hAnsi="Times New Roman" w:cs="Times New Roman"/>
         </w:rPr>
-        <w:t>time</w:t>
+        <w:t>Growing divisions over these newer issues did not replace existing disagreements over social-welfare policy, a process described as conflict extension</w:t>
       </w:r>
       <w:r>
         <w:rPr>
@@ -1636,43 +1486,25 @@
         <w:rPr>
           <w:rFonts w:ascii="Times New Roman" w:hAnsi="Times New Roman" w:cs="Times New Roman"/>
         </w:rPr>
-        <w:t>Additionally</w:t>
-      </w:r>
-      <w:r>
-        <w:rPr>
-          <w:rFonts w:ascii="Times New Roman" w:hAnsi="Times New Roman" w:cs="Times New Roman"/>
-        </w:rPr>
-        <w:t xml:space="preserve">, there was also a greater differentiation between the </w:t>
-      </w:r>
-      <w:r>
-        <w:rPr>
-          <w:rFonts w:ascii="Times New Roman" w:hAnsi="Times New Roman" w:cs="Times New Roman"/>
-        </w:rPr>
-        <w:t>parties’ electoral bases</w:t>
-      </w:r>
-      <w:r>
-        <w:rPr>
-          <w:rFonts w:ascii="Times New Roman" w:hAnsi="Times New Roman" w:cs="Times New Roman"/>
-        </w:rPr>
-        <w:t xml:space="preserve">. Polarization in Congress </w:t>
-      </w:r>
-      <w:r>
-        <w:rPr>
-          <w:rFonts w:ascii="Times New Roman" w:hAnsi="Times New Roman" w:cs="Times New Roman"/>
-        </w:rPr>
-        <w:t>was linked</w:t>
-      </w:r>
-      <w:r>
-        <w:rPr>
-          <w:rFonts w:ascii="Times New Roman" w:hAnsi="Times New Roman" w:cs="Times New Roman"/>
-        </w:rPr>
-        <w:t xml:space="preserve"> to the changes in the electoral</w:t>
-      </w:r>
-      <w:r>
-        <w:rPr>
-          <w:rFonts w:ascii="Times New Roman" w:hAnsi="Times New Roman" w:cs="Times New Roman"/>
-        </w:rPr>
-        <w:t>, with party loyalty increasing as voters vote more consistently on the party they identify the most with. Identificati</w:t>
+        <w:t>These congressional divisions were also linked to increasingly distinct electoral bases</w:t>
+      </w:r>
+      <w:r>
+        <w:rPr>
+          <w:rFonts w:ascii="Times New Roman" w:hAnsi="Times New Roman" w:cs="Times New Roman"/>
+        </w:rPr>
+        <w:t xml:space="preserve">. </w:t>
+      </w:r>
+      <w:r>
+        <w:rPr>
+          <w:rFonts w:ascii="Times New Roman" w:hAnsi="Times New Roman" w:cs="Times New Roman"/>
+        </w:rPr>
+        <w:t>Party loyalty increased as voters supported the party they identified with more consistently</w:t>
+      </w:r>
+      <w:r>
+        <w:rPr>
+          <w:rFonts w:ascii="Times New Roman" w:hAnsi="Times New Roman" w:cs="Times New Roman"/>
+        </w:rPr>
+        <w:t>. Identificati</w:t>
       </w:r>
       <w:r>
         <w:rPr>
@@ -1720,25 +1552,13 @@
         <w:rPr>
           <w:rFonts w:ascii="Times New Roman" w:hAnsi="Times New Roman" w:cs="Times New Roman"/>
         </w:rPr>
-        <w:t xml:space="preserve">es, leading to </w:t>
-      </w:r>
-      <w:r>
-        <w:rPr>
-          <w:rFonts w:ascii="Times New Roman" w:hAnsi="Times New Roman" w:cs="Times New Roman"/>
-        </w:rPr>
-        <w:t>congressional parties represent</w:t>
-      </w:r>
-      <w:r>
-        <w:rPr>
-          <w:rFonts w:ascii="Times New Roman" w:hAnsi="Times New Roman" w:cs="Times New Roman"/>
-        </w:rPr>
-        <w:t xml:space="preserve"> </w:t>
-      </w:r>
-      <w:r>
-        <w:rPr>
-          <w:rFonts w:ascii="Times New Roman" w:hAnsi="Times New Roman" w:cs="Times New Roman"/>
-        </w:rPr>
-        <w:t>increasingly distinct electoral constituencies</w:t>
+        <w:t xml:space="preserve">es, </w:t>
+      </w:r>
+      <w:r>
+        <w:rPr>
+          <w:rFonts w:ascii="Times New Roman" w:hAnsi="Times New Roman" w:cs="Times New Roman"/>
+        </w:rPr>
+        <w:t>with congressional parties representing increasingly distinct electoral constituencies.</w:t>
       </w:r>
       <w:r>
         <w:rPr>
@@ -1848,13 +1668,13 @@
         <w:rPr>
           <w:rFonts w:ascii="Times New Roman" w:hAnsi="Times New Roman" w:cs="Times New Roman"/>
         </w:rPr>
-        <w:t>. W</w:t>
-      </w:r>
-      <w:r>
-        <w:rPr>
-          <w:rFonts w:ascii="Times New Roman" w:hAnsi="Times New Roman" w:cs="Times New Roman"/>
-        </w:rPr>
-        <w:t>hile</w:t>
+        <w:t>.</w:t>
+      </w:r>
+      <w:r>
+        <w:rPr>
+          <w:rFonts w:ascii="Times New Roman" w:hAnsi="Times New Roman" w:cs="Times New Roman"/>
+        </w:rPr>
+        <w:t xml:space="preserve"> In contrast,</w:t>
       </w:r>
       <w:r>
         <w:rPr>
@@ -2012,31 +1832,20 @@
         <w:rPr>
           <w:rFonts w:ascii="Times New Roman" w:hAnsi="Times New Roman" w:cs="Times New Roman"/>
         </w:rPr>
-        <w:t>T</w:t>
-      </w:r>
-      <w:r>
-        <w:rPr>
-          <w:rFonts w:ascii="Times New Roman" w:hAnsi="Times New Roman" w:cs="Times New Roman"/>
-        </w:rPr>
-        <w:t>h</w:t>
-      </w:r>
-      <w:r>
-        <w:rPr>
-          <w:rFonts w:ascii="Times New Roman" w:hAnsi="Times New Roman" w:cs="Times New Roman"/>
-        </w:rPr>
-        <w:t>e</w:t>
-      </w:r>
-      <w:r>
-        <w:rPr>
-          <w:rFonts w:ascii="Times New Roman" w:hAnsi="Times New Roman" w:cs="Times New Roman"/>
-        </w:rPr>
-        <w:t xml:space="preserve"> previous</w:t>
-      </w:r>
-      <w:r>
-        <w:rPr>
-          <w:rFonts w:ascii="Times New Roman" w:hAnsi="Times New Roman" w:cs="Times New Roman"/>
-        </w:rPr>
-        <w:t xml:space="preserve"> voting-based findings rely on estimated positions derived from legislators’ roll-call records. DW-NOMINATE places legislators with similar voting records close together, with polarisation measured by the distance between the parties’ mean positions on the liberal–conservative dimension</w:t>
+        <w:t>In roll-call-based analyses, legislators’ positions are estimated from their voting records</w:t>
+      </w:r>
+      <w:r>
+        <w:rPr>
+          <w:rFonts w:ascii="Times New Roman" w:hAnsi="Times New Roman" w:cs="Times New Roman"/>
+        </w:rPr>
+        <w:t xml:space="preserve">. DW-NOMINATE places legislators with similar voting records close together, with polarisation </w:t>
+      </w:r>
+      <w:r>
+        <w:rPr>
+          <w:rFonts w:ascii="Times New Roman" w:hAnsi="Times New Roman" w:cs="Times New Roman"/>
+        </w:rPr>
+        <w:lastRenderedPageBreak/>
+        <w:t>measured by the distance between the parties’ mean positions on the liberal–conservative dimension</w:t>
       </w:r>
       <w:r>
         <w:rPr>
@@ -2126,7 +1935,6 @@
         <w:rPr>
           <w:rFonts w:ascii="Times New Roman" w:hAnsi="Times New Roman" w:cs="Times New Roman"/>
         </w:rPr>
-        <w:lastRenderedPageBreak/>
         <w:t xml:space="preserve">The ideological meaning of a NOMINATE dimension is not necessarily consistent across historical periods </w:t>
       </w:r>
       <w:r>
@@ -2163,7 +1971,7 @@
         <w:rPr>
           <w:rFonts w:ascii="Times New Roman" w:hAnsi="Times New Roman" w:cs="Times New Roman"/>
         </w:rPr>
-        <w:t xml:space="preserve">. Historical comparisons therefore require attention to what policies and alternatives behind the scores concern. Accounting for civil-rights policy content, contemporary partisan differences </w:t>
+        <w:t xml:space="preserve">. Historical comparisons therefore require attention to what policies and alternatives behind the scores concern. Accounting for policy content, contemporary partisan differences </w:t>
       </w:r>
       <w:r>
         <w:rPr>
@@ -2175,6 +1983,12 @@
         <w:rPr>
           <w:rFonts w:ascii="Times New Roman" w:hAnsi="Times New Roman" w:cs="Times New Roman"/>
         </w:rPr>
+        <w:t xml:space="preserve"> </w:t>
+      </w:r>
+      <w:r>
+        <w:rPr>
+          <w:rFonts w:ascii="Times New Roman" w:hAnsi="Times New Roman" w:cs="Times New Roman"/>
+        </w:rPr>
         <w:t>are smaller than those following Reconstruction, despite increasing since the 1970s</w:t>
       </w:r>
       <w:r>
@@ -2229,7 +2043,31 @@
         <w:rPr>
           <w:rFonts w:ascii="Times New Roman" w:hAnsi="Times New Roman" w:cs="Times New Roman"/>
         </w:rPr>
-        <w:t>The frequency with which different issues are voted on also matters, as greater attention to issues that already divide the parties can increase voting-based polarisation without equivalent changes in legislators’ positions. However, increased polarisation remained evident when comparable survey questions were used to hold the agenda constant between 1996 and 2008, indicating that the increase was not simply a consequence of a changing agend</w:t>
+        <w:t xml:space="preserve">The frequency with which different issues are voted on also matters, as greater attention to issues that already divide the parties can increase voting-based polarisation without equivalent changes in legislators’ positions. </w:t>
+      </w:r>
+      <w:r>
+        <w:rPr>
+          <w:rFonts w:ascii="Times New Roman" w:hAnsi="Times New Roman" w:cs="Times New Roman"/>
+        </w:rPr>
+        <w:t>Nevertheless</w:t>
+      </w:r>
+      <w:r>
+        <w:rPr>
+          <w:rFonts w:ascii="Times New Roman" w:hAnsi="Times New Roman" w:cs="Times New Roman"/>
+        </w:rPr>
+        <w:t xml:space="preserve">, increased polarisation remained evident when comparable survey questions were used </w:t>
+      </w:r>
+      <w:r>
+        <w:rPr>
+          <w:rFonts w:ascii="Times New Roman" w:hAnsi="Times New Roman" w:cs="Times New Roman"/>
+        </w:rPr>
+        <w:t>holding</w:t>
+      </w:r>
+      <w:r>
+        <w:rPr>
+          <w:rFonts w:ascii="Times New Roman" w:hAnsi="Times New Roman" w:cs="Times New Roman"/>
+        </w:rPr>
+        <w:t xml:space="preserve"> the agenda constant between 1996 and 2008, indicating that the increase was not simply a consequence of a changing agend</w:t>
       </w:r>
       <w:r>
         <w:rPr>
@@ -2341,7 +2179,14 @@
         <w:rPr>
           <w:rFonts w:ascii="Times New Roman" w:hAnsi="Times New Roman" w:cs="Times New Roman"/>
         </w:rPr>
-        <w:t>Finally, recorded roll calls represent a selected subset of legislative decisions because their use is often discretionary. A large number of recorded votes therefore does not necessarily guarantee that the observed votes are representative of the broader universe of legislative decisions, and this selection can affect estimates of legislators’ ideal point</w:t>
+        <w:t xml:space="preserve">Finally, recorded roll calls represent a selected subset of legislative decisions because their use is often discretionary. A large number of recorded votes therefore does not necessarily guarantee that the observed votes are representative of the broader universe of legislative </w:t>
+      </w:r>
+      <w:r>
+        <w:rPr>
+          <w:rFonts w:ascii="Times New Roman" w:hAnsi="Times New Roman" w:cs="Times New Roman"/>
+        </w:rPr>
+        <w:lastRenderedPageBreak/>
+        <w:t>decisions, and this selection can affect estimates of legislators’ ideal point</w:t>
       </w:r>
       <w:r>
         <w:rPr>
@@ -2397,26 +2242,7 @@
         <w:rPr>
           <w:rFonts w:ascii="Times New Roman" w:hAnsi="Times New Roman" w:cs="Times New Roman"/>
         </w:rPr>
-        <w:t xml:space="preserve">These limitations of voting-based measures are </w:t>
-      </w:r>
-      <w:r>
-        <w:rPr>
-          <w:rFonts w:ascii="Times New Roman" w:hAnsi="Times New Roman" w:cs="Times New Roman"/>
-        </w:rPr>
-        <w:t>especially</w:t>
-      </w:r>
-      <w:r>
-        <w:rPr>
-          <w:rFonts w:ascii="Times New Roman" w:hAnsi="Times New Roman" w:cs="Times New Roman"/>
-        </w:rPr>
-        <w:t xml:space="preserve"> relevant when using DW-NOMINATE to validate speech-based positions. The voting-based positions are themselves </w:t>
-      </w:r>
-      <w:r>
-        <w:rPr>
-          <w:rFonts w:ascii="Times New Roman" w:hAnsi="Times New Roman" w:cs="Times New Roman"/>
-        </w:rPr>
-        <w:lastRenderedPageBreak/>
-        <w:t xml:space="preserve">estimates rather than directly observed quantities, and show statistical uncertainties through bootstrap standard errors </w:t>
+        <w:t xml:space="preserve">These limitations of voting-based measures are especially relevant when using DW-NOMINATE to validate speech-based positions. The voting-based positions are themselves estimates rather than directly observed quantities, and show statistical uncertainties through bootstrap standard errors </w:t>
       </w:r>
       <w:r>
         <w:rPr>
@@ -2512,570 +2338,703 @@
           <w:b/>
           <w:bCs/>
         </w:rPr>
-        <w:t xml:space="preserve">2.2.3 </w:t>
-      </w:r>
-      <w:r>
-        <w:rPr>
-          <w:rFonts w:ascii="Times New Roman" w:hAnsi="Times New Roman" w:cs="Times New Roman"/>
-          <w:b/>
-          <w:bCs/>
-        </w:rPr>
-        <w:t>Comparing Speech-Based and Voting-Based Evidence</w:t>
+        <w:t>2.2.3 Comparing Speech-Based and Voting-Based Evidence</w:t>
       </w:r>
     </w:p>
     <w:p>
       <w:pPr>
         <w:spacing w:line="480" w:lineRule="auto"/>
+        <w:rPr>
+          <w:rFonts w:ascii="Times New Roman" w:hAnsi="Times New Roman" w:cs="Times New Roman"/>
+        </w:rPr>
       </w:pPr>
       <w:r>
-        <w:t>Speech-based positions in the US Senate show patterns related to, but different from, voting-based position</w:t>
-      </w:r>
-      <w:r>
-        <w:t xml:space="preserve"> </w:t>
-      </w:r>
-      <w:r>
-        <w:t xml:space="preserve"> </w:t>
-      </w:r>
-      <w:r>
+        <w:rPr>
+          <w:rFonts w:ascii="Times New Roman" w:hAnsi="Times New Roman" w:cs="Times New Roman"/>
+        </w:rPr>
+        <w:t xml:space="preserve">Speech-based positions in the US Senate show patterns related to, but different from, voting-based position  </w:t>
+      </w:r>
+      <w:r>
+        <w:rPr>
+          <w:rFonts w:ascii="Times New Roman" w:hAnsi="Times New Roman" w:cs="Times New Roman"/>
+        </w:rPr>
         <w:fldChar w:fldCharType="begin"/>
       </w:r>
       <w:r>
+        <w:rPr>
+          <w:rFonts w:ascii="Times New Roman" w:hAnsi="Times New Roman" w:cs="Times New Roman"/>
+        </w:rPr>
         <w:instrText xml:space="preserve"> ADDIN ZOTERO_ITEM CSL_CITATION {"citationID":"iM92EOro","properties":{"formattedCitation":"(Lauderdale and Herzog 2016)","plainCitation":"(Lauderdale and Herzog 2016)","noteIndex":0},"citationItems":[{"id":237,"uris":["http://zotero.org/groups/6681328/items/UFF3DLZ4"],"itemData":{"id":237,"type":"article-journal","abstract":"Existing approaches to measuring political disagreement from text data perform poorly except when applied to narrowly selected texts discussing the same issues and written in the same style. We demonstrate the first viable approach for estimating legislator-specific scores from the entire speech corpus of a legislature, while also producing extensive information about the evolution of speech polarization and politically loaded language. In the Irish Dáil, we show that the dominant dimension of speech variation is government–opposition, with ministers more extreme on this dimension than backbenchers, and a second dimension distinguishing between the establishment and anti-establishment opposition parties. In the U. S. Senate, we estimate a dimension that has moderate within-party correlations with scales based on roll-call votes and campaign donation patterns; however, we observe greater overlap across parties in speech positions than roll-call positions and partisan polarization in speeches varies more clearly in response to major political events.","container-title":"Political Analysis","DOI":"10.1093/pan/mpw017","ISSN":"1047-1987, 1476-4989","issue":"3","journalAbbreviation":"Polit. anal.","language":"en","license":"https://www.cambridge.org/core/terms","page":"374-394","source":"DOI.org (Crossref)","title":"Measuring Political Positions from Legislative Speech","volume":"24","author":[{"family":"Lauderdale","given":"Benjamin E."},{"family":"Herzog","given":"Alexander"}],"issued":{"date-parts":[["2016"]]}}}],"schema":"https://github.com/citation-style-language/schema/raw/master/csl-citation.json"} </w:instrText>
       </w:r>
       <w:r>
+        <w:rPr>
+          <w:rFonts w:ascii="Times New Roman" w:hAnsi="Times New Roman" w:cs="Times New Roman"/>
+        </w:rPr>
         <w:fldChar w:fldCharType="separate"/>
       </w:r>
       <w:r>
+        <w:rPr>
+          <w:rFonts w:ascii="Times New Roman" w:hAnsi="Times New Roman" w:cs="Times New Roman"/>
+        </w:rPr>
         <w:t>(Lauderdale and Herzog 2016)</w:t>
       </w:r>
       <w:r>
+        <w:rPr>
+          <w:rFonts w:ascii="Times New Roman" w:hAnsi="Times New Roman" w:cs="Times New Roman"/>
+        </w:rPr>
         <w:fldChar w:fldCharType="end"/>
       </w:r>
       <w:r>
-        <w:t>. Congressional linguistic partisanship</w:t>
-      </w:r>
-      <w:r>
-        <w:t>, which captures how distinct the parties’ language is,</w:t>
-      </w:r>
-      <w:r>
-        <w:t xml:space="preserve"> increased sharply from the early 1990s</w:t>
-      </w:r>
-      <w:r>
-        <w:t xml:space="preserve"> </w:t>
-      </w:r>
-      <w:r>
+        <w:rPr>
+          <w:rFonts w:ascii="Times New Roman" w:hAnsi="Times New Roman" w:cs="Times New Roman"/>
+        </w:rPr>
+        <w:t xml:space="preserve">. Congressional linguistic partisanship, which captures how distinct the parties’ language is, increased sharply from the early 1990s </w:t>
+      </w:r>
+      <w:r>
+        <w:rPr>
+          <w:rFonts w:ascii="Times New Roman" w:hAnsi="Times New Roman" w:cs="Times New Roman"/>
+        </w:rPr>
         <w:fldChar w:fldCharType="begin"/>
       </w:r>
       <w:r>
+        <w:rPr>
+          <w:rFonts w:ascii="Times New Roman" w:hAnsi="Times New Roman" w:cs="Times New Roman"/>
+        </w:rPr>
         <w:instrText xml:space="preserve"> ADDIN ZOTERO_ITEM CSL_CITATION {"citationID":"klQTVJm2","properties":{"formattedCitation":"(Gentzkow, Shapiro, and Taddy 2019)","plainCitation":"(Gentzkow, Shapiro, and Taddy 2019)","noteIndex":0},"citationItems":[{"id":233,"uris":["http://zotero.org/groups/6681328/items/TQGM25XV"],"itemData":{"id":233,"type":"article-journal","abstract":"We study the problem of measuring group differences in choices when the dimensionality of the choice set is large. We show that standard approaches suffer from a severe finite-sample bias, and we propose an estimator that applies recent advances in machine learning to address this bias. We apply this method to measure trends in the partisanship of congressional speech from 1873 to 2016, defining partisanship to be the ease with which an observer could infer a congressperson's party from a single utterance. Our estimates imply that partisanship is far greater in recent years than in the past, and that it increased sharply in the early 1990s after remaining low and relatively constant over the preceding century.","container-title":"Econometrica","DOI":"10.3982/ECTA16566","ISSN":"1468-0262","issue":"4","language":"en","license":"© 2019 The Econometric Society","page":"1307-1340","source":"Wiley Online Library","title":"Measuring Group Differences in High-Dimensional Choices: Method and Application to Congressional Speech","title-short":"Measuring Group Differences in High-Dimensional Choices","volume":"87","author":[{"family":"Gentzkow","given":"Matthew"},{"family":"Shapiro","given":"Jesse M."},{"family":"Taddy","given":"Matt"}],"issued":{"date-parts":[["2019"]]}}}],"schema":"https://github.com/citation-style-language/schema/raw/master/csl-citation.json"} </w:instrText>
       </w:r>
       <w:r>
+        <w:rPr>
+          <w:rFonts w:ascii="Times New Roman" w:hAnsi="Times New Roman" w:cs="Times New Roman"/>
+        </w:rPr>
         <w:fldChar w:fldCharType="separate"/>
       </w:r>
       <w:r>
+        <w:rPr>
+          <w:rFonts w:ascii="Times New Roman" w:hAnsi="Times New Roman" w:cs="Times New Roman"/>
+        </w:rPr>
         <w:t>(Gentzkow, Shapiro, and Taddy 2019)</w:t>
       </w:r>
       <w:r>
+        <w:rPr>
+          <w:rFonts w:ascii="Times New Roman" w:hAnsi="Times New Roman" w:cs="Times New Roman"/>
+        </w:rPr>
         <w:fldChar w:fldCharType="end"/>
       </w:r>
       <w:r>
+        <w:rPr>
+          <w:rFonts w:ascii="Times New Roman" w:hAnsi="Times New Roman" w:cs="Times New Roman"/>
+        </w:rPr>
         <w:t xml:space="preserve">, later than the rise in voting-based polarisation described above </w:t>
       </w:r>
       <w:r>
+        <w:rPr>
+          <w:rFonts w:ascii="Times New Roman" w:hAnsi="Times New Roman" w:cs="Times New Roman"/>
+        </w:rPr>
         <w:fldChar w:fldCharType="begin"/>
       </w:r>
       <w:r>
+        <w:rPr>
+          <w:rFonts w:ascii="Times New Roman" w:hAnsi="Times New Roman" w:cs="Times New Roman"/>
+        </w:rPr>
         <w:instrText xml:space="preserve"> ADDIN ZOTERO_ITEM CSL_CITATION {"citationID":"8YRPxexj","properties":{"formattedCitation":"(Poole and Rosenthal 2007)","plainCitation":"(Poole and Rosenthal 2007)","noteIndex":0},"citationItems":[{"id":340,"uris":["http://zotero.org/groups/6681328/items/6PNL5E44"],"itemData":{"id":340,"type":"book","abstract":"In Ideology and Congress, authors Poole and Rosenthal have analyzed over 13 million individual roll call votes spanning the two centuries since Congress began recording votes in 1789. By tracing the voting patterns of Congress throughout the country&amp;#39;s history, the authors find that, despite a wide array of issues facing legislators, over 81 percent of their voting decisions can be attributed to a consistent ideological position ranging from ultraconservatism to ultraliberalism. In their classic 1997 volume, Congress: A Political Economic History of Roll Call Voting, roll call voting became the framework for a novel interpretation of important episodes in American political and economic history. Congress demonstrated that roll call voting has a very simple structure and that, for most of American history, roll call voting patterns have maintained a core stability based on two great issues: the extent of government regulation of, and intervention in, the economy; and race. In this new, paperback volume, the authors include nineteen years of additional data, bringing in the period from 1986 through 2004.","edition":"2nd revised","ISBN":"978-1-4128-0608-4","language":"en","note":"Google-Books-ID: KaVfAAAAQBAJ","number-of-pages":"363","publisher":"Transaction Publishers","source":"Google Books","title":"Ideology and Congress: Second Revised Edition of Congress: A Political Economic History of Roll Call Voting","title-short":"Ideology and Congress","author":[{"family":"Poole","given":"Keith T."},{"family":"Rosenthal","given":"Howard"}],"issued":{"date-parts":[["2007"]]}}}],"schema":"https://github.com/citation-style-language/schema/raw/master/csl-citation.json"} </w:instrText>
       </w:r>
       <w:r>
+        <w:rPr>
+          <w:rFonts w:ascii="Times New Roman" w:hAnsi="Times New Roman" w:cs="Times New Roman"/>
+        </w:rPr>
         <w:fldChar w:fldCharType="separate"/>
       </w:r>
       <w:r>
+        <w:rPr>
+          <w:rFonts w:ascii="Times New Roman" w:hAnsi="Times New Roman" w:cs="Times New Roman"/>
+        </w:rPr>
         <w:t>(Poole and Rosenthal 2007)</w:t>
       </w:r>
       <w:r>
+        <w:rPr>
+          <w:rFonts w:ascii="Times New Roman" w:hAnsi="Times New Roman" w:cs="Times New Roman"/>
+        </w:rPr>
         <w:fldChar w:fldCharType="end"/>
       </w:r>
       <w:r>
+        <w:rPr>
+          <w:rFonts w:ascii="Times New Roman" w:hAnsi="Times New Roman" w:cs="Times New Roman"/>
+        </w:rPr>
         <w:t>.</w:t>
       </w:r>
     </w:p>
     <w:p>
       <w:pPr>
         <w:spacing w:line="480" w:lineRule="auto"/>
+        <w:rPr>
+          <w:rFonts w:ascii="Times New Roman" w:hAnsi="Times New Roman" w:cs="Times New Roman"/>
+        </w:rPr>
       </w:pPr>
       <w:r>
-        <w:t>A further difference concerns changes in party distance over time.</w:t>
-      </w:r>
-      <w:r>
-        <w:t xml:space="preserve"> </w:t>
-      </w:r>
-      <w:r>
-        <w:t>In the US Senate, the distance between Democrats’ and Republicans’ mean speech-based positions approximately doubled between 1995 and 2014</w:t>
-      </w:r>
-      <w:r>
-        <w:t>, a larger increase than observed in the corresponding roll-call estimates</w:t>
-      </w:r>
-      <w:r>
-        <w:t xml:space="preserve">. </w:t>
-      </w:r>
-      <w:r>
-        <w:t>In this applicatio</w:t>
-      </w:r>
-      <w:r>
-        <w:t>n,</w:t>
-      </w:r>
-      <w:r>
-        <w:t xml:space="preserve"> </w:t>
-      </w:r>
-      <w:r>
-        <w:t>chang</w:t>
-      </w:r>
-      <w:r>
-        <w:t>es</w:t>
-      </w:r>
-      <w:r>
-        <w:t xml:space="preserve"> </w:t>
-      </w:r>
-      <w:r>
-        <w:t xml:space="preserve">in </w:t>
-      </w:r>
-      <w:r>
-        <w:t>party means reflect changes in membership</w:t>
-      </w:r>
-      <w:r>
-        <w:t xml:space="preserve">, while </w:t>
-      </w:r>
-      <w:r>
-        <w:t>individual positions are held constant</w:t>
-      </w:r>
-      <w:r>
-        <w:t xml:space="preserve"> </w:t>
-      </w:r>
-      <w:r>
+        <w:rPr>
+          <w:rFonts w:ascii="Times New Roman" w:hAnsi="Times New Roman" w:cs="Times New Roman"/>
+        </w:rPr>
+        <w:t xml:space="preserve">A further difference concerns changes in party distance over time. In the US Senate, the </w:t>
+      </w:r>
+      <w:r>
+        <w:rPr>
+          <w:rFonts w:ascii="Times New Roman" w:hAnsi="Times New Roman" w:cs="Times New Roman"/>
+        </w:rPr>
+        <w:t>separation</w:t>
+      </w:r>
+      <w:r>
+        <w:rPr>
+          <w:rFonts w:ascii="Times New Roman" w:hAnsi="Times New Roman" w:cs="Times New Roman"/>
+        </w:rPr>
+        <w:t xml:space="preserve"> between Democrats’ and Republicans’ mean speech-based positions approximately doubled between 1995 and 2014, a larger increase than observed in the corresponding roll-call estimates. In this application, changes in party means reflect changes in membership, while individual positions are held constant </w:t>
+      </w:r>
+      <w:r>
+        <w:rPr>
+          <w:rFonts w:ascii="Times New Roman" w:hAnsi="Times New Roman" w:cs="Times New Roman"/>
+        </w:rPr>
         <w:fldChar w:fldCharType="begin"/>
       </w:r>
       <w:r>
+        <w:rPr>
+          <w:rFonts w:ascii="Times New Roman" w:hAnsi="Times New Roman" w:cs="Times New Roman"/>
+        </w:rPr>
         <w:instrText xml:space="preserve"> ADDIN ZOTERO_ITEM CSL_CITATION {"citationID":"JFrnxVyE","properties":{"formattedCitation":"(Lauderdale and Herzog 2016)","plainCitation":"(Lauderdale and Herzog 2016)","noteIndex":0},"citationItems":[{"id":237,"uris":["http://zotero.org/groups/6681328/items/UFF3DLZ4"],"itemData":{"id":237,"type":"article-journal","abstract":"Existing approaches to measuring political disagreement from text data perform poorly except when applied to narrowly selected texts discussing the same issues and written in the same style. We demonstrate the first viable approach for estimating legislator-specific scores from the entire speech corpus of a legislature, while also producing extensive information about the evolution of speech polarization and politically loaded language. In the Irish Dáil, we show that the dominant dimension of speech variation is government–opposition, with ministers more extreme on this dimension than backbenchers, and a second dimension distinguishing between the establishment and anti-establishment opposition parties. In the U. S. Senate, we estimate a dimension that has moderate within-party correlations with scales based on roll-call votes and campaign donation patterns; however, we observe greater overlap across parties in speech positions than roll-call positions and partisan polarization in speeches varies more clearly in response to major political events.","container-title":"Political Analysis","DOI":"10.1093/pan/mpw017","ISSN":"1047-1987, 1476-4989","issue":"3","journalAbbreviation":"Polit. anal.","language":"en","license":"https://www.cambridge.org/core/terms","page":"374-394","source":"DOI.org (Crossref)","title":"Measuring Political Positions from Legislative Speech","volume":"24","author":[{"family":"Lauderdale","given":"Benjamin E."},{"family":"Herzog","given":"Alexander"}],"issued":{"date-parts":[["2016"]]}}}],"schema":"https://github.com/citation-style-language/schema/raw/master/csl-citation.json"} </w:instrText>
       </w:r>
       <w:r>
+        <w:rPr>
+          <w:rFonts w:ascii="Times New Roman" w:hAnsi="Times New Roman" w:cs="Times New Roman"/>
+        </w:rPr>
         <w:fldChar w:fldCharType="separate"/>
       </w:r>
       <w:r>
+        <w:rPr>
+          <w:rFonts w:ascii="Times New Roman" w:hAnsi="Times New Roman" w:cs="Times New Roman"/>
+        </w:rPr>
         <w:t>(Lauderdale and Herzog 2016)</w:t>
       </w:r>
       <w:r>
+        <w:rPr>
+          <w:rFonts w:ascii="Times New Roman" w:hAnsi="Times New Roman" w:cs="Times New Roman"/>
+        </w:rPr>
         <w:fldChar w:fldCharType="end"/>
       </w:r>
       <w:r>
+        <w:rPr>
+          <w:rFonts w:ascii="Times New Roman" w:hAnsi="Times New Roman" w:cs="Times New Roman"/>
+        </w:rPr>
         <w:t>.</w:t>
       </w:r>
     </w:p>
     <w:p>
       <w:pPr>
         <w:spacing w:line="480" w:lineRule="auto"/>
+        <w:rPr>
+          <w:rFonts w:ascii="Times New Roman" w:hAnsi="Times New Roman" w:cs="Times New Roman"/>
+        </w:rPr>
       </w:pPr>
       <w:r>
-        <w:t>Wordshoal, a speech-based method, estimates individual positions by combining information from separate debates. Democrats and Republicans overlap more in their speech-based positions than in their voting-based positions</w:t>
-      </w:r>
-      <w:r>
-        <w:t>, while w</w:t>
-      </w:r>
-      <w:r>
-        <w:t>ithin-party speech positions correlate mode</w:t>
-      </w:r>
-      <w:r>
-        <w:t>r</w:t>
-      </w:r>
-      <w:r>
-        <w:t>ately with voting-based positions</w:t>
-      </w:r>
-      <w:r>
-        <w:t xml:space="preserve"> </w:t>
-      </w:r>
-      <w:r>
+        <w:rPr>
+          <w:rFonts w:ascii="Times New Roman" w:hAnsi="Times New Roman" w:cs="Times New Roman"/>
+        </w:rPr>
+        <w:t xml:space="preserve">Wordshoal, a speech-based method, estimates </w:t>
+      </w:r>
+      <w:r>
+        <w:rPr>
+          <w:rFonts w:ascii="Times New Roman" w:hAnsi="Times New Roman" w:cs="Times New Roman"/>
+        </w:rPr>
+        <w:t xml:space="preserve">those </w:t>
+      </w:r>
+      <w:r>
+        <w:rPr>
+          <w:rFonts w:ascii="Times New Roman" w:hAnsi="Times New Roman" w:cs="Times New Roman"/>
+        </w:rPr>
+        <w:t xml:space="preserve">individual positions by combining information from separate debates. Democrats and Republicans overlap more in their speech-based positions than in their voting-based positions, while within-party speech positions correlate moderately with voting-based positions </w:t>
+      </w:r>
+      <w:r>
+        <w:rPr>
+          <w:rFonts w:ascii="Times New Roman" w:hAnsi="Times New Roman" w:cs="Times New Roman"/>
+        </w:rPr>
         <w:fldChar w:fldCharType="begin"/>
       </w:r>
       <w:r>
+        <w:rPr>
+          <w:rFonts w:ascii="Times New Roman" w:hAnsi="Times New Roman" w:cs="Times New Roman"/>
+        </w:rPr>
         <w:instrText xml:space="preserve"> ADDIN ZOTERO_ITEM CSL_CITATION {"citationID":"Z6Jglms9","properties":{"formattedCitation":"(Lauderdale and Herzog 2016)","plainCitation":"(Lauderdale and Herzog 2016)","noteIndex":0},"citationItems":[{"id":237,"uris":["http://zotero.org/groups/6681328/items/UFF3DLZ4"],"itemData":{"id":237,"type":"article-journal","abstract":"Existing approaches to measuring political disagreement from text data perform poorly except when applied to narrowly selected texts discussing the same issues and written in the same style. We demonstrate the first viable approach for estimating legislator-specific scores from the entire speech corpus of a legislature, while also producing extensive information about the evolution of speech polarization and politically loaded language. In the Irish Dáil, we show that the dominant dimension of speech variation is government–opposition, with ministers more extreme on this dimension than backbenchers, and a second dimension distinguishing between the establishment and anti-establishment opposition parties. In the U. S. Senate, we estimate a dimension that has moderate within-party correlations with scales based on roll-call votes and campaign donation patterns; however, we observe greater overlap across parties in speech positions than roll-call positions and partisan polarization in speeches varies more clearly in response to major political events.","container-title":"Political Analysis","DOI":"10.1093/pan/mpw017","ISSN":"1047-1987, 1476-4989","issue":"3","journalAbbreviation":"Polit. anal.","language":"en","license":"https://www.cambridge.org/core/terms","page":"374-394","source":"DOI.org (Crossref)","title":"Measuring Political Positions from Legislative Speech","volume":"24","author":[{"family":"Lauderdale","given":"Benjamin E."},{"family":"Herzog","given":"Alexander"}],"issued":{"date-parts":[["2016"]]}}}],"schema":"https://github.com/citation-style-language/schema/raw/master/csl-citation.json"} </w:instrText>
       </w:r>
       <w:r>
+        <w:rPr>
+          <w:rFonts w:ascii="Times New Roman" w:hAnsi="Times New Roman" w:cs="Times New Roman"/>
+        </w:rPr>
         <w:fldChar w:fldCharType="separate"/>
       </w:r>
       <w:r>
+        <w:rPr>
+          <w:rFonts w:ascii="Times New Roman" w:hAnsi="Times New Roman" w:cs="Times New Roman"/>
+        </w:rPr>
         <w:t>(Lauderdale and Herzog 2016)</w:t>
       </w:r>
       <w:r>
+        <w:rPr>
+          <w:rFonts w:ascii="Times New Roman" w:hAnsi="Times New Roman" w:cs="Times New Roman"/>
+        </w:rPr>
         <w:fldChar w:fldCharType="end"/>
       </w:r>
       <w:r>
-        <w:t>.</w:t>
-      </w:r>
-      <w:r>
-        <w:t xml:space="preserve"> </w:t>
-      </w:r>
-      <w:r>
-        <w:t xml:space="preserve">In a Swiss </w:t>
-      </w:r>
-      <w:r>
-        <w:t>analysis</w:t>
-      </w:r>
-      <w:r>
-        <w:t>, text scaling also reveals greater intraparty variation than roll-</w:t>
-      </w:r>
-      <w:r>
+        <w:rPr>
+          <w:rFonts w:ascii="Times New Roman" w:hAnsi="Times New Roman" w:cs="Times New Roman"/>
+        </w:rPr>
+        <w:t xml:space="preserve">. In a Swiss </w:t>
+      </w:r>
+      <w:r>
+        <w:rPr>
+          <w:rFonts w:ascii="Times New Roman" w:hAnsi="Times New Roman" w:cs="Times New Roman"/>
+        </w:rPr>
         <w:lastRenderedPageBreak/>
-        <w:t>call estimates, despite high overall agreement between the measures</w:t>
-      </w:r>
-      <w:r>
-        <w:t xml:space="preserve"> </w:t>
-      </w:r>
-      <w:r>
+        <w:t xml:space="preserve">analysis, text scaling also reveals greater intraparty variation than roll-call estimates, despite high overall agreement between the measures </w:t>
+      </w:r>
+      <w:r>
+        <w:rPr>
+          <w:rFonts w:ascii="Times New Roman" w:hAnsi="Times New Roman" w:cs="Times New Roman"/>
+        </w:rPr>
         <w:fldChar w:fldCharType="begin"/>
       </w:r>
       <w:r>
+        <w:rPr>
+          <w:rFonts w:ascii="Times New Roman" w:hAnsi="Times New Roman" w:cs="Times New Roman"/>
+        </w:rPr>
         <w:instrText xml:space="preserve"> ADDIN ZOTERO_ITEM CSL_CITATION {"citationID":"iDLJt1es","properties":{"formattedCitation":"(Schwarz, Traber, and Benoit 2017)","plainCitation":"(Schwarz, Traber, and Benoit 2017)","noteIndex":0},"citationItems":[{"id":160,"uris":["http://zotero.org/groups/6681328/items/JH9AI7CJ"],"itemData":{"id":160,"type":"article-journal","abstract":"Well-established methods exist for measuring party positions, but reliable means for estimating intra-party preferences remain underdeveloped. While most efforts focus on estimating the ideal points of individual legislators based on inductive scaling of roll call votes, this data suffers from two problems: selection bias due to unrecorded votes and strong party discipline, which tends to make voting a strategic rather than a sincere indication of preferences. By contrast, legislative speeches are relatively unconstrained, as party leaders are less likely to punish MPs for speaking freely as long as they vote with the party line. Yet, the differences between roll call estimations and text scalings remain essentially unexplored, despite the growing application of statistical analysis of textual data to measure policy preferences. Our paper addresses this lacuna by exploiting a rich feature of the Swiss legislature: on most bills, legislators both vote and speak many times. Using this data, we compare text-based scaling of ideal points to vote-based scaling from a crucial piece of energy legislation. Our findings confirm that text scalings reveal larger intra-party differences than roll calls. Using regression models, we further explain the differences between roll call and text scalings by attributing differences to constituency-level preferences for energy policy.","container-title":"Political Science Research and Methods","DOI":"10.1017/psrm.2015.77","ISSN":"2049-8470, 2049-8489","issue":"2","language":"en","page":"379-396","source":"Cambridge University Press","title":"Estimating Intra-Party Preferences: Comparing Speeches to Votes","title-short":"Estimating Intra-Party Preferences","volume":"5","author":[{"family":"Schwarz","given":"Daniel"},{"family":"Traber","given":"Denise"},{"family":"Benoit","given":"Kenneth"}],"issued":{"date-parts":[["2017",4]]}}}],"schema":"https://github.com/citation-style-language/schema/raw/master/csl-citation.json"} </w:instrText>
       </w:r>
       <w:r>
+        <w:rPr>
+          <w:rFonts w:ascii="Times New Roman" w:hAnsi="Times New Roman" w:cs="Times New Roman"/>
+        </w:rPr>
         <w:fldChar w:fldCharType="separate"/>
       </w:r>
       <w:r>
+        <w:rPr>
+          <w:rFonts w:ascii="Times New Roman" w:hAnsi="Times New Roman" w:cs="Times New Roman"/>
+        </w:rPr>
         <w:t>(Schwarz, Traber, and Benoit 2017)</w:t>
       </w:r>
       <w:r>
+        <w:rPr>
+          <w:rFonts w:ascii="Times New Roman" w:hAnsi="Times New Roman" w:cs="Times New Roman"/>
+        </w:rPr>
         <w:fldChar w:fldCharType="end"/>
       </w:r>
       <w:r>
-        <w:t>.</w:t>
-      </w:r>
-      <w:r>
-        <w:t xml:space="preserve"> </w:t>
+        <w:rPr>
+          <w:rFonts w:ascii="Times New Roman" w:hAnsi="Times New Roman" w:cs="Times New Roman"/>
+        </w:rPr>
+        <w:t xml:space="preserve">. </w:t>
       </w:r>
     </w:p>
     <w:p>
       <w:pPr>
         <w:spacing w:line="480" w:lineRule="auto"/>
+        <w:rPr>
+          <w:rFonts w:ascii="Times New Roman" w:hAnsi="Times New Roman" w:cs="Times New Roman"/>
+        </w:rPr>
       </w:pPr>
       <w:r>
-        <w:t xml:space="preserve">At the debate polarization also followed different patterns in speech and voting. Speech-based polarisation </w:t>
-      </w:r>
-      <w:r>
-        <w:t xml:space="preserve">peaked during the 2009–2010 healthcare debates, but this peak did not appear in the roll-call series because </w:t>
-      </w:r>
-      <w:r>
-        <w:t>this issue</w:t>
-      </w:r>
-      <w:r>
-        <w:t xml:space="preserve"> occupied substantial Senate time and political attention but involved relatively few recorded votes</w:t>
-      </w:r>
-      <w:r>
-        <w:t xml:space="preserve"> </w:t>
-      </w:r>
-      <w:r>
+        <w:rPr>
+          <w:rFonts w:ascii="Times New Roman" w:hAnsi="Times New Roman" w:cs="Times New Roman"/>
+        </w:rPr>
+        <w:t xml:space="preserve">At the debate </w:t>
+      </w:r>
+      <w:r>
+        <w:rPr>
+          <w:rFonts w:ascii="Times New Roman" w:hAnsi="Times New Roman" w:cs="Times New Roman"/>
+        </w:rPr>
+        <w:t xml:space="preserve">level, </w:t>
+      </w:r>
+      <w:r>
+        <w:rPr>
+          <w:rFonts w:ascii="Times New Roman" w:hAnsi="Times New Roman" w:cs="Times New Roman"/>
+        </w:rPr>
+        <w:t>polari</w:t>
+      </w:r>
+      <w:r>
+        <w:rPr>
+          <w:rFonts w:ascii="Times New Roman" w:hAnsi="Times New Roman" w:cs="Times New Roman"/>
+        </w:rPr>
+        <w:t>sa</w:t>
+      </w:r>
+      <w:r>
+        <w:rPr>
+          <w:rFonts w:ascii="Times New Roman" w:hAnsi="Times New Roman" w:cs="Times New Roman"/>
+        </w:rPr>
+        <w:t>tion also followed different patterns in speech and voting. Speech-based polarisation peaked during the 2009–2010 healthcare debates, but this peak did not appear in the roll-call series because th</w:t>
+      </w:r>
+      <w:r>
+        <w:rPr>
+          <w:rFonts w:ascii="Times New Roman" w:hAnsi="Times New Roman" w:cs="Times New Roman"/>
+        </w:rPr>
+        <w:t>e</w:t>
+      </w:r>
+      <w:r>
+        <w:rPr>
+          <w:rFonts w:ascii="Times New Roman" w:hAnsi="Times New Roman" w:cs="Times New Roman"/>
+        </w:rPr>
+        <w:t xml:space="preserve"> issue occupied substantial Senate time and political attention </w:t>
+      </w:r>
+      <w:r>
+        <w:rPr>
+          <w:rFonts w:ascii="Times New Roman" w:hAnsi="Times New Roman" w:cs="Times New Roman"/>
+        </w:rPr>
+        <w:t>while</w:t>
+      </w:r>
+      <w:r>
+        <w:rPr>
+          <w:rFonts w:ascii="Times New Roman" w:hAnsi="Times New Roman" w:cs="Times New Roman"/>
+        </w:rPr>
+        <w:t xml:space="preserve"> involv</w:t>
+      </w:r>
+      <w:r>
+        <w:rPr>
+          <w:rFonts w:ascii="Times New Roman" w:hAnsi="Times New Roman" w:cs="Times New Roman"/>
+        </w:rPr>
+        <w:t>ing</w:t>
+      </w:r>
+      <w:r>
+        <w:rPr>
+          <w:rFonts w:ascii="Times New Roman" w:hAnsi="Times New Roman" w:cs="Times New Roman"/>
+        </w:rPr>
+        <w:t xml:space="preserve"> relatively few recorded votes </w:t>
+      </w:r>
+      <w:r>
+        <w:rPr>
+          <w:rFonts w:ascii="Times New Roman" w:hAnsi="Times New Roman" w:cs="Times New Roman"/>
+        </w:rPr>
         <w:fldChar w:fldCharType="begin"/>
       </w:r>
       <w:r>
+        <w:rPr>
+          <w:rFonts w:ascii="Times New Roman" w:hAnsi="Times New Roman" w:cs="Times New Roman"/>
+        </w:rPr>
         <w:instrText xml:space="preserve"> ADDIN ZOTERO_ITEM CSL_CITATION {"citationID":"s0WXR8uw","properties":{"formattedCitation":"(Lauderdale and Herzog 2016)","plainCitation":"(Lauderdale and Herzog 2016)","noteIndex":0},"citationItems":[{"id":237,"uris":["http://zotero.org/groups/6681328/items/UFF3DLZ4"],"itemData":{"id":237,"type":"article-journal","abstract":"Existing approaches to measuring political disagreement from text data perform poorly except when applied to narrowly selected texts discussing the same issues and written in the same style. We demonstrate the first viable approach for estimating legislator-specific scores from the entire speech corpus of a legislature, while also producing extensive information about the evolution of speech polarization and politically loaded language. In the Irish Dáil, we show that the dominant dimension of speech variation is government–opposition, with ministers more extreme on this dimension than backbenchers, and a second dimension distinguishing between the establishment and anti-establishment opposition parties. In the U. S. Senate, we estimate a dimension that has moderate within-party correlations with scales based on roll-call votes and campaign donation patterns; however, we observe greater overlap across parties in speech positions than roll-call positions and partisan polarization in speeches varies more clearly in response to major political events.","container-title":"Political Analysis","DOI":"10.1093/pan/mpw017","ISSN":"1047-1987, 1476-4989","issue":"3","journalAbbreviation":"Polit. anal.","language":"en","license":"https://www.cambridge.org/core/terms","page":"374-394","source":"DOI.org (Crossref)","title":"Measuring Political Positions from Legislative Speech","volume":"24","author":[{"family":"Lauderdale","given":"Benjamin E."},{"family":"Herzog","given":"Alexander"}],"issued":{"date-parts":[["2016"]]}}}],"schema":"https://github.com/citation-style-language/schema/raw/master/csl-citation.json"} </w:instrText>
       </w:r>
       <w:r>
+        <w:rPr>
+          <w:rFonts w:ascii="Times New Roman" w:hAnsi="Times New Roman" w:cs="Times New Roman"/>
+        </w:rPr>
         <w:fldChar w:fldCharType="separate"/>
       </w:r>
       <w:r>
+        <w:rPr>
+          <w:rFonts w:ascii="Times New Roman" w:hAnsi="Times New Roman" w:cs="Times New Roman"/>
+        </w:rPr>
         <w:t>(Lauderdale and Herzog 2016)</w:t>
       </w:r>
       <w:r>
+        <w:rPr>
+          <w:rFonts w:ascii="Times New Roman" w:hAnsi="Times New Roman" w:cs="Times New Roman"/>
+        </w:rPr>
         <w:fldChar w:fldCharType="end"/>
       </w:r>
       <w:r>
-        <w:t>.</w:t>
-      </w:r>
-      <w:r>
-        <w:t xml:space="preserve"> </w:t>
+        <w:rPr>
+          <w:rFonts w:ascii="Times New Roman" w:hAnsi="Times New Roman" w:cs="Times New Roman"/>
+        </w:rPr>
+        <w:t xml:space="preserve">. </w:t>
       </w:r>
     </w:p>
     <w:p>
       <w:pPr>
         <w:spacing w:line="480" w:lineRule="auto"/>
+        <w:rPr>
+          <w:rFonts w:ascii="Times New Roman" w:hAnsi="Times New Roman" w:cs="Times New Roman"/>
+        </w:rPr>
       </w:pPr>
       <w:r>
-        <w:t xml:space="preserve">Beyond floor speeches, </w:t>
-      </w:r>
-      <w:r>
-        <w:t xml:space="preserve">congressional online communication </w:t>
-      </w:r>
-      <w:r>
-        <w:t>became</w:t>
-      </w:r>
-      <w:r>
-        <w:t xml:space="preserve"> more partisan and negativ</w:t>
-      </w:r>
-      <w:r>
-        <w:t>e</w:t>
-      </w:r>
-      <w:r>
-        <w:t xml:space="preserve"> between 2009 and 2022</w:t>
-      </w:r>
-      <w:r>
-        <w:t xml:space="preserve"> </w:t>
-      </w:r>
-      <w:r>
-        <w:fldChar w:fldCharType="begin"/>
-      </w:r>
-      <w:r>
-        <w:instrText xml:space="preserve"> ADDIN ZOTERO_ITEM CSL_CITATION {"citationID":"Ls5g5qRw","properties":{"formattedCitation":"(Kistner et al. 2026)","plainCitation":"(Kistner et al. 2026)","noteIndex":0},"citationItems":[{"id":175,"uris":["http://zotero.org/groups/6681328/items/2LULLUGT"],"itemData":{"id":175,"type":"article-journal","abstract":"The authors introduce a multi-platform dataset of congressional tweets, Facebook posts, and email newsletters from 2009 to 2022, classify communicative purposes, and scale messages on a continuous partisan dimension. After validation, they find congressional rhetoric has become more partisan and negative as social media use increased, and that partisan and negative messages receive elevated engagement.","container-title":"American Political Science Review","DOI":"10.1017/S0003055426101841","page":"1–18","title":"Measuring Partisanship and Representation in Online Congressional Communications","author":[{"family":"Kistner","given":"Michael R."},{"family":"Heseltine","given":"Michael"},{"family":"Alvarez","given":"Robert"},{"family":"Fitch","given":"Maya"},{"family":"Lothamer","given":"Lucas"},{"family":"Simas","given":"Elizabeth N."}],"issued":{"date-parts":[["2026"]]}}}],"schema":"https://github.com/citation-style-language/schema/raw/master/csl-citation.json"} </w:instrText>
-      </w:r>
-      <w:r>
-        <w:fldChar w:fldCharType="separate"/>
-      </w:r>
-      <w:r>
-        <w:rPr>
-          <w:rFonts w:ascii="Aptos" w:hAnsi="Aptos"/>
-        </w:rPr>
-        <w:t>(Kistner et al. 2026)</w:t>
-      </w:r>
-      <w:r>
-        <w:fldChar w:fldCharType="end"/>
-      </w:r>
-      <w:r>
-        <w:t>.</w:t>
+        <w:rPr>
+          <w:rFonts w:ascii="Times New Roman" w:hAnsi="Times New Roman" w:cs="Times New Roman"/>
+        </w:rPr>
+        <w:t>Votes and speech can also be analysed together rather than only compared through separate estimates. Combining both sources through sparse factor analysis identifies an ideological dimension and another associated with leadership in the US Senate. This distinction shows why differences in political language cannot automatically be interpreted as ideological differences (Kim, Londregan, and Ratkovic 2018).</w:t>
       </w:r>
     </w:p>
     <w:p>
       <w:pPr>
         <w:spacing w:line="480" w:lineRule="auto"/>
+        <w:rPr>
+          <w:rFonts w:ascii="Times New Roman" w:hAnsi="Times New Roman" w:cs="Times New Roman"/>
+          <w:b/>
+          <w:bCs/>
+        </w:rPr>
       </w:pPr>
       <w:r>
-        <w:t>Votes and speech can also be analysed together rather than only compared through separate estimates. Combining both sources through sparse factor analysis identifies an ideological dimension and another associated with leadership in the US Senate</w:t>
-      </w:r>
-      <w:r>
-        <w:t xml:space="preserve">. </w:t>
-      </w:r>
-      <w:r>
-        <w:t>This distinction shows why differences in political language cannot automatically be interpreted as ideological differences</w:t>
-      </w:r>
-      <w:r>
-        <w:t xml:space="preserve"> </w:t>
-      </w:r>
-      <w:r>
-        <w:t>(Kim, Londregan, and Ratkovic 2018).</w:t>
+        <w:rPr>
+          <w:rFonts w:ascii="Times New Roman" w:hAnsi="Times New Roman" w:cs="Times New Roman"/>
+          <w:b/>
+          <w:bCs/>
+        </w:rPr>
+        <w:t>2.2.4 Interpreting Text-Based Positions</w:t>
       </w:r>
     </w:p>
     <w:p>
       <w:pPr>
         <w:spacing w:line="480" w:lineRule="auto"/>
         <w:rPr>
-          <w:b/>
-          <w:bCs/>
+          <w:rFonts w:ascii="Times New Roman" w:hAnsi="Times New Roman" w:cs="Times New Roman"/>
         </w:rPr>
       </w:pPr>
       <w:r>
         <w:rPr>
-          <w:b/>
-          <w:bCs/>
-        </w:rPr>
-        <w:t xml:space="preserve">2.2.4 </w:t>
-      </w:r>
-      <w:r>
-        <w:rPr>
-          <w:b/>
-          <w:bCs/>
-        </w:rPr>
-        <w:t>Interpreting Text-Based Positions</w:t>
+          <w:rFonts w:ascii="Times New Roman" w:hAnsi="Times New Roman" w:cs="Times New Roman"/>
+        </w:rPr>
+        <w:t>Beyond floor speeches, congressional online communication became more partisan and negative between 2009 and 2022 (Kistner et al. 2026).</w:t>
+      </w:r>
+      <w:r>
+        <w:rPr>
+          <w:rFonts w:ascii="Times New Roman" w:hAnsi="Times New Roman" w:cs="Times New Roman"/>
+        </w:rPr>
+        <w:t xml:space="preserve"> However, e</w:t>
+      </w:r>
+      <w:r>
+        <w:rPr>
+          <w:rFonts w:ascii="Times New Roman" w:hAnsi="Times New Roman" w:cs="Times New Roman"/>
+        </w:rPr>
+        <w:t xml:space="preserve">stimated partisan positions </w:t>
+      </w:r>
+      <w:r>
+        <w:rPr>
+          <w:rFonts w:ascii="Times New Roman" w:hAnsi="Times New Roman" w:cs="Times New Roman"/>
+        </w:rPr>
+        <w:t>are not necessarily consistent across communication sources</w:t>
+      </w:r>
+      <w:r>
+        <w:rPr>
+          <w:rFonts w:ascii="Times New Roman" w:hAnsi="Times New Roman" w:cs="Times New Roman"/>
+        </w:rPr>
+        <w:t xml:space="preserve">. Comparing tweets, Facebook posts, newsletters, press releases and one-minute House floor speeches from the 116th Congress shows that Democrats and Republicans remain distinguishable across the venues, while members’ relative positions within each party frequently </w:t>
+      </w:r>
+      <w:r>
+        <w:rPr>
+          <w:rFonts w:ascii="Times New Roman" w:hAnsi="Times New Roman" w:cs="Times New Roman"/>
+        </w:rPr>
+        <w:t>differ across</w:t>
+      </w:r>
+      <w:r>
+        <w:rPr>
+          <w:rFonts w:ascii="Times New Roman" w:hAnsi="Times New Roman" w:cs="Times New Roman"/>
+        </w:rPr>
+        <w:t xml:space="preserve"> venues. Someone’s placement relative to their fellow Democrats or Republicans is therefore not consistent across all communication sources </w:t>
+      </w:r>
+      <w:r>
+        <w:rPr>
+          <w:rFonts w:ascii="Times New Roman" w:hAnsi="Times New Roman" w:cs="Times New Roman"/>
+        </w:rPr>
+        <w:fldChar w:fldCharType="begin"/>
+      </w:r>
+      <w:r>
+        <w:rPr>
+          <w:rFonts w:ascii="Times New Roman" w:hAnsi="Times New Roman" w:cs="Times New Roman"/>
+        </w:rPr>
+        <w:instrText xml:space="preserve"> ADDIN ZOTERO_ITEM CSL_CITATION {"citationID":"M9vbZadr","properties":{"formattedCitation":"(Green et al. 2024)","plainCitation":"(Green et al. 2024)","noteIndex":0},"citationItems":[{"id":236,"uris":["http://zotero.org/groups/6681328/items/AE9KUAJC"],"itemData":{"id":236,"type":"article-journal","abstract":"Legislative activity—whether votes or communications—is often represented in a single partisan or ideological dimension. But as lawmakers communicate in various venues (e.g., traditional, direct, or social media), the extent to which these estimates are interchangeable—reflecting a common underlying dimension—is unclear. We estimate a partisan dimension in members’ tweets, Facebook posts, e-newsletters, press releases, and one-minute House floor speeches for the 116th U.S. Congress and test the extent to which representations remain consistent across different venues. We find that while Democrats are consistently separable from Republicans, members’ relative intra-party positions frequently shift between venues. This is likely driven by differences in the affordances and audiences present in each venue, as venues with more nationalized audiences (such as social media) show higher levels of rhetorical polarization than venues with more local audiences (e-newsletters). These results suggest that the level of polarization we observe depends on where we look, and that the scholars of congressional communication should explicitly consider the input they use to measure partisanship.","container-title":"Political Research Quarterly","DOI":"10.1177/10659129241236685","ISSN":"1065-9129","issue":"3","language":"EN","page":"653-668","publisher":"SAGE Publications Inc","source":"SAGE Journals","title":"Cross-Platform Partisan Positioning in Congressional Speech","volume":"77","author":[{"family":"Green","given":"Jon"},{"family":"Shoub","given":"Kelsey"},{"family":"Blum","given":"Rachel"},{"family":"Cormack","given":"Lindsey"}],"issued":{"date-parts":[["2024",9,1]]}}}],"schema":"https://github.com/citation-style-language/schema/raw/master/csl-citation.json"} </w:instrText>
+      </w:r>
+      <w:r>
+        <w:rPr>
+          <w:rFonts w:ascii="Times New Roman" w:hAnsi="Times New Roman" w:cs="Times New Roman"/>
+        </w:rPr>
+        <w:fldChar w:fldCharType="separate"/>
+      </w:r>
+      <w:r>
+        <w:rPr>
+          <w:rFonts w:ascii="Times New Roman" w:hAnsi="Times New Roman" w:cs="Times New Roman"/>
+        </w:rPr>
+        <w:t>(Green et al. 2024)</w:t>
+      </w:r>
+      <w:r>
+        <w:rPr>
+          <w:rFonts w:ascii="Times New Roman" w:hAnsi="Times New Roman" w:cs="Times New Roman"/>
+        </w:rPr>
+        <w:fldChar w:fldCharType="end"/>
+      </w:r>
+      <w:r>
+        <w:rPr>
+          <w:rFonts w:ascii="Times New Roman" w:hAnsi="Times New Roman" w:cs="Times New Roman"/>
+        </w:rPr>
+        <w:t>.</w:t>
       </w:r>
     </w:p>
     <w:p>
       <w:pPr>
         <w:spacing w:line="480" w:lineRule="auto"/>
+        <w:rPr>
+          <w:rFonts w:ascii="Times New Roman" w:hAnsi="Times New Roman" w:cs="Times New Roman"/>
+        </w:rPr>
       </w:pPr>
       <w:r>
-        <w:t>Estimated partisan positions depend on which communication source is analysed. C</w:t>
-      </w:r>
-      <w:r>
-        <w:t>ompar</w:t>
-      </w:r>
-      <w:r>
-        <w:t>ing</w:t>
-      </w:r>
-      <w:r>
-        <w:t xml:space="preserve"> tweets, Facebook posts, newsletters, press releases and one-minute House floor speeches from the </w:t>
-      </w:r>
-      <w:r>
-        <w:rPr>
-          <w:b/>
-          <w:bCs/>
-        </w:rPr>
-        <w:t>116th Congress</w:t>
-      </w:r>
-      <w:r>
-        <w:rPr>
-          <w:b/>
-          <w:bCs/>
-        </w:rPr>
-        <w:t xml:space="preserve"> </w:t>
-      </w:r>
-      <w:r>
-        <w:t xml:space="preserve">shows that </w:t>
-      </w:r>
-      <w:r>
-        <w:t>Democrats and Republicans remain distinguishable across the venues</w:t>
-      </w:r>
-      <w:r>
-        <w:t xml:space="preserve">, while </w:t>
-      </w:r>
-      <w:r>
-        <w:t>members’ relative positions</w:t>
-      </w:r>
-      <w:r>
-        <w:t xml:space="preserve"> within each party</w:t>
-      </w:r>
-      <w:r>
-        <w:t xml:space="preserve"> frequently </w:t>
-      </w:r>
-      <w:r>
-        <w:t xml:space="preserve">differ </w:t>
-      </w:r>
-      <w:r>
-        <w:t xml:space="preserve"> across venues. Someone’s placement relative to their fellow Democrats or Republicans is therefore not consistent across all communication sources</w:t>
-      </w:r>
-      <w:r>
-        <w:t xml:space="preserve"> </w:t>
-      </w:r>
-      <w:r>
+        <w:rPr>
+          <w:rFonts w:ascii="Times New Roman" w:hAnsi="Times New Roman" w:cs="Times New Roman"/>
+        </w:rPr>
+        <w:t xml:space="preserve">The interpretation of these estimates also depends on which texts and words are selected. Wordfish, another text-based method, estimates a single dimension, so the input texts need to reflect the policy distinction being examined. In German manifestos from 1969–2005, including all words produced estimated party movements dominated by changes in the </w:t>
+      </w:r>
+      <w:r>
+        <w:rPr>
+          <w:rFonts w:ascii="Times New Roman" w:hAnsi="Times New Roman" w:cs="Times New Roman"/>
+        </w:rPr>
+        <w:lastRenderedPageBreak/>
+        <w:t xml:space="preserve">agenda, while excluding rare words reduced this effect. Changes in vocabulary over time can therefore be mistaken for ideological movement </w:t>
+      </w:r>
+      <w:r>
+        <w:rPr>
+          <w:rFonts w:ascii="Times New Roman" w:hAnsi="Times New Roman" w:cs="Times New Roman"/>
+        </w:rPr>
         <w:fldChar w:fldCharType="begin"/>
       </w:r>
       <w:r>
-        <w:instrText xml:space="preserve"> ADDIN ZOTERO_ITEM CSL_CITATION {"citationID":"M9vbZadr","properties":{"formattedCitation":"(Green et al. 2024)","plainCitation":"(Green et al. 2024)","noteIndex":0},"citationItems":[{"id":236,"uris":["http://zotero.org/groups/6681328/items/AE9KUAJC"],"itemData":{"id":236,"type":"article-journal","abstract":"Legislative activity—whether votes or communications—is often represented in a single partisan or ideological dimension. But as lawmakers communicate in various venues (e.g., traditional, direct, or social media), the extent to which these estimates are interchangeable—reflecting a common underlying dimension—is unclear. We estimate a partisan dimension in members’ tweets, Facebook posts, e-newsletters, press releases, and one-minute House floor speeches for the 116th U.S. Congress and test the extent to which representations remain consistent across different venues. We find that while Democrats are consistently separable from Republicans, members’ relative intra-party positions frequently shift between venues. This is likely driven by differences in the affordances and audiences present in each venue, as venues with more nationalized audiences (such as social media) show higher levels of rhetorical polarization than venues with more local audiences (e-newsletters). These results suggest that the level of polarization we observe depends on where we look, and that the scholars of congressional communication should explicitly consider the input they use to measure partisanship.","container-title":"Political Research Quarterly","DOI":"10.1177/10659129241236685","ISSN":"1065-9129","issue":"3","language":"EN","page":"653-668","publisher":"SAGE Publications Inc","source":"SAGE Journals","title":"Cross-Platform Partisan Positioning in Congressional Speech","volume":"77","author":[{"family":"Green","given":"Jon"},{"family":"Shoub","given":"Kelsey"},{"family":"Blum","given":"Rachel"},{"family":"Cormack","given":"Lindsey"}],"issued":{"date-parts":[["2024",9,1]]}}}],"schema":"https://github.com/citation-style-language/schema/raw/master/csl-citation.json"} </w:instrText>
-      </w:r>
-      <w:r>
+        <w:rPr>
+          <w:rFonts w:ascii="Times New Roman" w:hAnsi="Times New Roman" w:cs="Times New Roman"/>
+        </w:rPr>
+        <w:instrText xml:space="preserve"> ADDIN ZOTERO_ITEM CSL_CITATION {"citationID":"SfqigJkV","properties":{"formattedCitation":"(Proksch and Slapin 2009)","plainCitation":"(Proksch and Slapin 2009)","noteIndex":0},"citationItems":[{"id":279,"uris":["http://zotero.org/groups/6681328/items/W9E4TYSG"],"itemData":{"id":279,"type":"article-journal","container-title":"German Politics","DOI":"10.1080/09644000903055799","ISSN":"0964-4008, 1743-8993","issue":"3","journalAbbreviation":"German Politics","language":"en","page":"323-344","source":"DOI.org (Crossref)","title":"How to Avoid Pitfalls in Statistical Analysis of Political Texts: The Case of Germany","title-short":"How to Avoid Pitfalls in Statistical Analysis of Political Texts","volume":"18","author":[{"family":"Proksch","given":"Sven-Oliver"},{"family":"Slapin","given":"Jonathan B."}],"issued":{"date-parts":[["2009",9]]}}}],"schema":"https://github.com/citation-style-language/schema/raw/master/csl-citation.json"} </w:instrText>
+      </w:r>
+      <w:r>
+        <w:rPr>
+          <w:rFonts w:ascii="Times New Roman" w:hAnsi="Times New Roman" w:cs="Times New Roman"/>
+        </w:rPr>
         <w:fldChar w:fldCharType="separate"/>
       </w:r>
       <w:r>
         <w:rPr>
-          <w:rFonts w:ascii="Aptos" w:hAnsi="Aptos"/>
-        </w:rPr>
-        <w:t>(Green et al. 2024)</w:t>
-      </w:r>
-      <w:r>
+          <w:rFonts w:ascii="Times New Roman" w:hAnsi="Times New Roman" w:cs="Times New Roman"/>
+        </w:rPr>
+        <w:t>(Proksch and Slapin 2009)</w:t>
+      </w:r>
+      <w:r>
+        <w:rPr>
+          <w:rFonts w:ascii="Times New Roman" w:hAnsi="Times New Roman" w:cs="Times New Roman"/>
+        </w:rPr>
         <w:fldChar w:fldCharType="end"/>
       </w:r>
       <w:r>
+        <w:rPr>
+          <w:rFonts w:ascii="Times New Roman" w:hAnsi="Times New Roman" w:cs="Times New Roman"/>
+        </w:rPr>
         <w:t xml:space="preserve">. </w:t>
       </w:r>
     </w:p>
     <w:p>
       <w:pPr>
         <w:spacing w:line="480" w:lineRule="auto"/>
+        <w:rPr>
+          <w:rFonts w:ascii="Times New Roman" w:hAnsi="Times New Roman" w:cs="Times New Roman"/>
+        </w:rPr>
       </w:pPr>
       <w:r>
-        <w:lastRenderedPageBreak/>
-        <w:t>The interpretation of these estimates also depends on which texts and words are selected. Wordfish, another text-based method, estimates a single dimension, so the input texts need to reflect the policy distinction being examined. In German manifestos from 1969–2005, including all words produced estimated party movements dominated by changes in the agenda, while excluding rare words reduced this effect. Changes in vocabulary over time can therefore be mistaken for ideological movement</w:t>
-      </w:r>
-      <w:r>
-        <w:t xml:space="preserve"> </w:t>
-      </w:r>
-      <w:r>
+        <w:rPr>
+          <w:rFonts w:ascii="Times New Roman" w:hAnsi="Times New Roman" w:cs="Times New Roman"/>
+        </w:rPr>
+        <w:t xml:space="preserve">The dominant differences in parliamentary language may </w:t>
+      </w:r>
+      <w:r>
+        <w:rPr>
+          <w:rFonts w:ascii="Times New Roman" w:hAnsi="Times New Roman" w:cs="Times New Roman"/>
+        </w:rPr>
+        <w:t>as a result</w:t>
+      </w:r>
+      <w:r>
+        <w:rPr>
+          <w:rFonts w:ascii="Times New Roman" w:hAnsi="Times New Roman" w:cs="Times New Roman"/>
+        </w:rPr>
+        <w:t xml:space="preserve"> not reflect the political distinction being examined. This concern motivates supervised approaches that incorporate party affiliation to guide the measurement towards partisan differences </w:t>
+      </w:r>
+      <w:r>
+        <w:rPr>
+          <w:rFonts w:ascii="Times New Roman" w:hAnsi="Times New Roman" w:cs="Times New Roman"/>
+        </w:rPr>
         <w:fldChar w:fldCharType="begin"/>
       </w:r>
       <w:r>
-        <w:instrText xml:space="preserve"> ADDIN ZOTERO_ITEM CSL_CITATION {"citationID":"SfqigJkV","properties":{"formattedCitation":"(Proksch and Slapin 2009)","plainCitation":"(Proksch and Slapin 2009)","noteIndex":0},"citationItems":[{"id":279,"uris":["http://zotero.org/groups/6681328/items/W9E4TYSG"],"itemData":{"id":279,"type":"article-journal","container-title":"German Politics","DOI":"10.1080/09644000903055799","ISSN":"0964-4008, 1743-8993","issue":"3","journalAbbreviation":"German Politics","language":"en","page":"323-344","source":"DOI.org (Crossref)","title":"How to Avoid Pitfalls in Statistical Analysis of Political Texts: The Case of Germany","title-short":"How to Avoid Pitfalls in Statistical Analysis of Political Texts","volume":"18","author":[{"family":"Proksch","given":"Sven-Oliver"},{"family":"Slapin","given":"Jonathan B."}],"issued":{"date-parts":[["2009",9]]}}}],"schema":"https://github.com/citation-style-language/schema/raw/master/csl-citation.json"} </w:instrText>
-      </w:r>
-      <w:r>
+        <w:rPr>
+          <w:rFonts w:ascii="Times New Roman" w:hAnsi="Times New Roman" w:cs="Times New Roman"/>
+        </w:rPr>
+        <w:instrText xml:space="preserve"> ADDIN ZOTERO_ITEM CSL_CITATION {"citationID":"incdo66S","properties":{"formattedCitation":"(Goet 2019)","plainCitation":"(Goet 2019)","noteIndex":0},"citationItems":[{"id":153,"uris":["http://zotero.org/groups/6681328/items/YDWDQ6XE"],"itemData":{"id":153,"type":"article-journal","abstract":"Political scientists can rely on a long tradition of applying unsupervised measurement models to estimate ideology and preferences from texts. However, in practice the hope that the dominant source of variation in their data is the quantity of interest is often not realized. In this paper, I argue that in the messy world of speeches we have to rely on supervised approaches that include information on party affiliation in order to produce meaningful estimates of polarization. To substantiate this argument, I introduce a validation framework that may be used to comparatively assess supervised and unsupervised methods, and estimate polarization on the basis of 6.2 million records of parliamentary speeches from the UK House of Commons over the period 1811–2015. Beyond introducing several important adjustments to existing estimation approaches, the paper’s methodological contribution therefore consists of outlining the challenges of applying unsupervised estimation techniques to speech data, and arguing in detail why we should instead rely on supervised methods to measure polarization.","container-title":"Political Analysis","DOI":"10.1017/pan.2019.2","ISSN":"1047-1987, 1476-4989","issue":"4","language":"en","page":"518-539","source":"Cambridge University Press","title":"Measuring Polarization with Text Analysis: Evidence from the UK House of Commons, 1811–2015","title-short":"Measuring Polarization with Text Analysis","volume":"27","author":[{"family":"Goet","given":"Niels D."}],"issued":{"date-parts":[["2019",10]]}}}],"schema":"https://github.com/citation-style-language/schema/raw/master/csl-citation.json"} </w:instrText>
+      </w:r>
+      <w:r>
+        <w:rPr>
+          <w:rFonts w:ascii="Times New Roman" w:hAnsi="Times New Roman" w:cs="Times New Roman"/>
+        </w:rPr>
         <w:fldChar w:fldCharType="separate"/>
       </w:r>
       <w:r>
         <w:rPr>
-          <w:rFonts w:ascii="Aptos" w:hAnsi="Aptos"/>
-        </w:rPr>
-        <w:t>(Proksch and Slapin 2009)</w:t>
-      </w:r>
-      <w:r>
+          <w:rFonts w:ascii="Times New Roman" w:hAnsi="Times New Roman" w:cs="Times New Roman"/>
+        </w:rPr>
+        <w:t>(Goet 2019)</w:t>
+      </w:r>
+      <w:r>
+        <w:rPr>
+          <w:rFonts w:ascii="Times New Roman" w:hAnsi="Times New Roman" w:cs="Times New Roman"/>
+        </w:rPr>
         <w:fldChar w:fldCharType="end"/>
       </w:r>
       <w:r>
-        <w:t xml:space="preserve">. </w:t>
-      </w:r>
-    </w:p>
-    <w:p>
-      <w:pPr>
-        <w:spacing w:line="480" w:lineRule="auto"/>
-      </w:pPr>
-      <w:r>
-        <w:t>The dominant differences in parliamentary language may therefore not reflect the political distinction being examined. This concern motivates supervised approaches that incorporate party affiliation to guide the measurement towards partisan differences</w:t>
-      </w:r>
-      <w:r>
-        <w:t xml:space="preserve"> </w:t>
-      </w:r>
-      <w:r>
+        <w:rPr>
+          <w:rFonts w:ascii="Times New Roman" w:hAnsi="Times New Roman" w:cs="Times New Roman"/>
+        </w:rPr>
+        <w:t xml:space="preserve">. This </w:t>
+      </w:r>
+      <w:r>
+        <w:rPr>
+          <w:rFonts w:ascii="Times New Roman" w:hAnsi="Times New Roman" w:cs="Times New Roman"/>
+        </w:rPr>
+        <w:t>provides a reason to</w:t>
+      </w:r>
+      <w:r>
+        <w:rPr>
+          <w:rFonts w:ascii="Times New Roman" w:hAnsi="Times New Roman" w:cs="Times New Roman"/>
+        </w:rPr>
+        <w:t xml:space="preserve"> examin</w:t>
+      </w:r>
+      <w:r>
+        <w:rPr>
+          <w:rFonts w:ascii="Times New Roman" w:hAnsi="Times New Roman" w:cs="Times New Roman"/>
+        </w:rPr>
+        <w:t>e</w:t>
+      </w:r>
+      <w:r>
+        <w:rPr>
+          <w:rFonts w:ascii="Times New Roman" w:hAnsi="Times New Roman" w:cs="Times New Roman"/>
+        </w:rPr>
+        <w:t xml:space="preserve"> alternative language-model approaches, including LLM-based methods that also allow researchers to specify the political dimensions they aim to measure </w:t>
+      </w:r>
+      <w:r>
+        <w:rPr>
+          <w:rFonts w:ascii="Times New Roman" w:hAnsi="Times New Roman" w:cs="Times New Roman"/>
+        </w:rPr>
         <w:fldChar w:fldCharType="begin"/>
       </w:r>
       <w:r>
-        <w:instrText xml:space="preserve"> ADDIN ZOTERO_ITEM CSL_CITATION {"citationID":"incdo66S","properties":{"formattedCitation":"(Goet 2019)","plainCitation":"(Goet 2019)","noteIndex":0},"citationItems":[{"id":153,"uris":["http://zotero.org/groups/6681328/items/YDWDQ6XE"],"itemData":{"id":153,"type":"article-journal","abstract":"Political scientists can rely on a long tradition of applying unsupervised measurement models to estimate ideology and preferences from texts. However, in practice the hope that the dominant source of variation in their data is the quantity of interest is often not realized. In this paper, I argue that in the messy world of speeches we have to rely on supervised approaches that include information on party affiliation in order to produce meaningful estimates of polarization. To substantiate this argument, I introduce a validation framework that may be used to comparatively assess supervised and unsupervised methods, and estimate polarization on the basis of 6.2 million records of parliamentary speeches from the UK House of Commons over the period 1811–2015. Beyond introducing several important adjustments to existing estimation approaches, the paper’s methodological contribution therefore consists of outlining the challenges of applying unsupervised estimation techniques to speech data, and arguing in detail why we should instead rely on supervised methods to measure polarization.","container-title":"Political Analysis","DOI":"10.1017/pan.2019.2","ISSN":"1047-1987, 1476-4989","issue":"4","language":"en","page":"518-539","source":"Cambridge University Press","title":"Measuring Polarization with Text Analysis: Evidence from the UK House of Commons, 1811–2015","title-short":"Measuring Polarization with Text Analysis","volume":"27","author":[{"family":"Goet","given":"Niels D."}],"issued":{"date-parts":[["2019",10]]}}}],"schema":"https://github.com/citation-style-language/schema/raw/master/csl-citation.json"} </w:instrText>
-      </w:r>
-      <w:r>
+        <w:rPr>
+          <w:rFonts w:ascii="Times New Roman" w:hAnsi="Times New Roman" w:cs="Times New Roman"/>
+        </w:rPr>
+        <w:instrText xml:space="preserve"> ADDIN ZOTERO_ITEM CSL_CITATION {"citationID":"cJUKGjgU","properties":{"formattedCitation":"(Burnham 2024)","plainCitation":"(Burnham 2024)","noteIndex":0},"citationItems":[{"id":239,"uris":["http://zotero.org/groups/6681328/items/GMDYYG3B"],"itemData":{"id":239,"type":"article","abstract":"This paper introduces \"Semantic Scaling,\" a novel method for ideal point estimation from text. I leverage large language models to classify documents based on their expressed stances and extract survey-like data. I then use item response theory to scale subjects from these data. Semantic Scaling significantly improves on existing text-based scaling methods, and allows researchers to explicitly define the ideological dimensions they measure. This represents the first scaling approach that allows such flexibility outside of survey instruments and opens new avenues of inquiry for populations difficult to survey. Additionally, it works with documents of varying length, and produces valid estimates of both mass and elite ideology. I demonstrate that the method can differentiate between policy preferences and in-group/out-group affect. Among the public, Semantic Scaling out-preforms Tweetscores according to human judgement; in Congress, it recaptures the first dimension DW-NOMINATE while allowing for greater flexibility in resolving construct validity challenges.","DOI":"10.48550/arXiv.2405.02472","note":"arXiv:2405.02472 [cs.CL]","number":"arXiv:2405.02472","publisher":"arXiv","source":"arXiv.org","title":"Semantic Scaling: Bayesian Ideal Point Estimates with Large Language Models","title-short":"Semantic Scaling","URL":"http://arxiv.org/abs/2405.02472","author":[{"family":"Burnham","given":"Michael"}],"accessed":{"date-parts":[["2026",10,2]]},"issued":{"date-parts":[["2024",5,3]]}}}],"schema":"https://github.com/citation-style-language/schema/raw/master/csl-citation.json"} </w:instrText>
+      </w:r>
+      <w:r>
+        <w:rPr>
+          <w:rFonts w:ascii="Times New Roman" w:hAnsi="Times New Roman" w:cs="Times New Roman"/>
+        </w:rPr>
         <w:fldChar w:fldCharType="separate"/>
       </w:r>
       <w:r>
         <w:rPr>
-          <w:rFonts w:ascii="Aptos" w:hAnsi="Aptos"/>
-        </w:rPr>
-        <w:t>(Goet 2019)</w:t>
-      </w:r>
-      <w:r>
+          <w:rFonts w:ascii="Times New Roman" w:hAnsi="Times New Roman" w:cs="Times New Roman"/>
+        </w:rPr>
+        <w:t>(Burnham 2024)</w:t>
+      </w:r>
+      <w:r>
+        <w:rPr>
+          <w:rFonts w:ascii="Times New Roman" w:hAnsi="Times New Roman" w:cs="Times New Roman"/>
+        </w:rPr>
         <w:fldChar w:fldCharType="end"/>
       </w:r>
       <w:r>
-        <w:t xml:space="preserve">. </w:t>
-      </w:r>
-      <w:r>
-        <w:t xml:space="preserve">This </w:t>
-      </w:r>
-      <w:r>
-        <w:t xml:space="preserve">motivates </w:t>
-      </w:r>
-      <w:r>
-        <w:t>examining alternative language-model approaches, including LLM-based methods</w:t>
-      </w:r>
-      <w:r>
-        <w:t xml:space="preserve"> </w:t>
-      </w:r>
-      <w:r>
-        <w:t>that also allow researchers to specify the political dimensions they aim to measure</w:t>
-      </w:r>
-      <w:r>
-        <w:t xml:space="preserve"> </w:t>
-      </w:r>
-      <w:r>
-        <w:fldChar w:fldCharType="begin"/>
-      </w:r>
-      <w:r>
-        <w:instrText xml:space="preserve"> ADDIN ZOTERO_ITEM CSL_CITATION {"citationID":"cJUKGjgU","properties":{"formattedCitation":"(Burnham 2024)","plainCitation":"(Burnham 2024)","noteIndex":0},"citationItems":[{"id":239,"uris":["http://zotero.org/groups/6681328/items/GMDYYG3B"],"itemData":{"id":239,"type":"article","abstract":"This paper introduces \"Semantic Scaling,\" a novel method for ideal point estimation from text. I leverage large language models to classify documents based on their expressed stances and extract survey-like data. I then use item response theory to scale subjects from these data. Semantic Scaling significantly improves on existing text-based scaling methods, and allows researchers to explicitly define the ideological dimensions they measure. This represents the first scaling approach that allows such flexibility outside of survey instruments and opens new avenues of inquiry for populations difficult to survey. Additionally, it works with documents of varying length, and produces valid estimates of both mass and elite ideology. I demonstrate that the method can differentiate between policy preferences and in-group/out-group affect. Among the public, Semantic Scaling out-preforms Tweetscores according to human judgement; in Congress, it recaptures the first dimension DW-NOMINATE while allowing for greater flexibility in resolving construct validity challenges.","DOI":"10.48550/arXiv.2405.02472","note":"arXiv:2405.02472 [cs.CL]","number":"arXiv:2405.02472","publisher":"arXiv","source":"arXiv.org","title":"Semantic Scaling: Bayesian Ideal Point Estimates with Large Language Models","title-short":"Semantic Scaling","URL":"http://arxiv.org/abs/2405.02472","author":[{"family":"Burnham","given":"Michael"}],"accessed":{"date-parts":[["2026",10,2]]},"issued":{"date-parts":[["2024",5,3]]}}}],"schema":"https://github.com/citation-style-language/schema/raw/master/csl-citation.json"} </w:instrText>
-      </w:r>
-      <w:r>
-        <w:fldChar w:fldCharType="separate"/>
-      </w:r>
-      <w:r>
-        <w:rPr>
-          <w:rFonts w:ascii="Aptos" w:hAnsi="Aptos"/>
-        </w:rPr>
-        <w:t>(Burnham 2024)</w:t>
-      </w:r>
-      <w:r>
-        <w:fldChar w:fldCharType="end"/>
-      </w:r>
-      <w:r>
-        <w:t>. The next section reviews findings on th</w:t>
-      </w:r>
-      <w:r>
-        <w:t>ese methods</w:t>
-      </w:r>
-      <w:r>
-        <w:t xml:space="preserve"> and whether </w:t>
-      </w:r>
-      <w:r>
-        <w:t>they</w:t>
-      </w:r>
-      <w:r>
-        <w:t xml:space="preserve"> can address some of the limitations identified above.</w:t>
+        <w:rPr>
+          <w:rFonts w:ascii="Times New Roman" w:hAnsi="Times New Roman" w:cs="Times New Roman"/>
+        </w:rPr>
+        <w:t>. The next section reviews findings on these methods and whether they can address some of the limitations identified above.</w:t>
       </w:r>
     </w:p>
     <w:sectPr>

</xml_diff>